<commit_message>
update API URL for production
</commit_message>
<xml_diff>
--- a/SpendWise_Project_Documentation.docx
+++ b/SpendWise_Project_Documentation.docx
@@ -6529,6 +6529,291 @@
       </w:r>
     </w:p>
     <w:p/>
+    <w:p/>
+    <w:p>
+      <w:r>
+        <w:t xml:space="preserve">  </w:t>
+      </w:r>
+      <w:r>
+        <w:rPr>
+          <w:b/>
+          <w:bCs/>
+        </w:rPr>
+        <w:t>React Router DOM</w:t>
+      </w:r>
+      <w:r>
+        <w:t xml:space="preserve"> – A library used to enable navigation between different pages in a React application without reloading the browser. </w:t>
+      </w:r>
+    </w:p>
+    <w:p>
+      <w:r>
+        <w:t xml:space="preserve">  </w:t>
+      </w:r>
+      <w:r>
+        <w:rPr>
+          <w:b/>
+          <w:bCs/>
+        </w:rPr>
+        <w:t>BrowserRouter</w:t>
+      </w:r>
+      <w:r>
+        <w:t xml:space="preserve"> – Wraps the entire application and enables routing using the browser's URL. </w:t>
+      </w:r>
+    </w:p>
+    <w:p>
+      <w:r>
+        <w:t xml:space="preserve">  </w:t>
+      </w:r>
+      <w:r>
+        <w:rPr>
+          <w:b/>
+          <w:bCs/>
+        </w:rPr>
+        <w:t>Routes</w:t>
+      </w:r>
+      <w:r>
+        <w:t xml:space="preserve"> – A container that holds all the route definitions of the application. </w:t>
+      </w:r>
+    </w:p>
+    <w:p>
+      <w:r>
+        <w:t xml:space="preserve">  </w:t>
+      </w:r>
+      <w:r>
+        <w:rPr>
+          <w:b/>
+          <w:bCs/>
+        </w:rPr>
+        <w:t>Route</w:t>
+      </w:r>
+      <w:r>
+        <w:t xml:space="preserve"> – Maps a specific URL path to the React component (page) that should be displayed. </w:t>
+      </w:r>
+    </w:p>
+    <w:p>
+      <w:r>
+        <w:t xml:space="preserve">  </w:t>
+      </w:r>
+      <w:r>
+        <w:rPr>
+          <w:b/>
+          <w:bCs/>
+        </w:rPr>
+        <w:t>NavLink</w:t>
+      </w:r>
+      <w:r>
+        <w:t xml:space="preserve"> – A special navigation link that automatically highlights the currently active page. </w:t>
+      </w:r>
+    </w:p>
+    <w:p>
+      <w:r>
+        <w:t xml:space="preserve">  </w:t>
+      </w:r>
+      <w:r>
+        <w:rPr>
+          <w:b/>
+          <w:bCs/>
+        </w:rPr>
+        <w:t>Outlet</w:t>
+      </w:r>
+      <w:r>
+        <w:t xml:space="preserve"> – A placeholder where the component of the currently selected route is rendered. </w:t>
+      </w:r>
+    </w:p>
+    <w:p>
+      <w:r>
+        <w:t xml:space="preserve">  </w:t>
+      </w:r>
+      <w:r>
+        <w:rPr>
+          <w:b/>
+          <w:bCs/>
+        </w:rPr>
+        <w:t>Layout Components</w:t>
+      </w:r>
+      <w:r>
+        <w:t xml:space="preserve"> – Components that provide a common structure (such as Sidebar and Navbar) shared across multiple pages. </w:t>
+      </w:r>
+    </w:p>
+    <w:p>
+      <w:r>
+        <w:t xml:space="preserve">  </w:t>
+      </w:r>
+      <w:r>
+        <w:rPr>
+          <w:b/>
+          <w:bCs/>
+        </w:rPr>
+        <w:t>Component Reusability</w:t>
+      </w:r>
+      <w:r>
+        <w:t xml:space="preserve"> – The practice of creating components once and using them in multiple places to reduce duplicate code. </w:t>
+      </w:r>
+    </w:p>
+    <w:p>
+      <w:r>
+        <w:t xml:space="preserve">  </w:t>
+      </w:r>
+      <w:r>
+        <w:rPr>
+          <w:b/>
+          <w:bCs/>
+        </w:rPr>
+        <w:t>DRY (Don't Repeat Yourself)</w:t>
+      </w:r>
+      <w:r>
+        <w:t xml:space="preserve"> – A software development principle that avoids writing the same code multiple times. </w:t>
+      </w:r>
+    </w:p>
+    <w:p>
+      <w:r>
+        <w:t xml:space="preserve">  </w:t>
+      </w:r>
+      <w:r>
+        <w:rPr>
+          <w:b/>
+          <w:bCs/>
+        </w:rPr>
+        <w:t>Single Responsibility Principle (SRP)</w:t>
+      </w:r>
+      <w:r>
+        <w:t xml:space="preserve"> – A design principle stating that each component or module should have only one specific responsibility. </w:t>
+      </w:r>
+    </w:p>
+    <w:p>
+      <w:r>
+        <w:t xml:space="preserve">  </w:t>
+      </w:r>
+      <w:r>
+        <w:rPr>
+          <w:b/>
+          <w:bCs/>
+        </w:rPr>
+        <w:t>Modular Project Structure</w:t>
+      </w:r>
+      <w:r>
+        <w:t xml:space="preserve"> – Organizing the project into separate folders and components based on their functionality for better readability and maintainability</w:t>
+      </w:r>
+    </w:p>
+    <w:p/>
+    <w:p>
+      <w:pPr>
+        <w:rPr>
+          <w:b/>
+          <w:bCs/>
+        </w:rPr>
+      </w:pPr>
+      <w:r>
+        <w:rPr>
+          <w:b/>
+          <w:bCs/>
+        </w:rPr>
+        <w:t>Concepts Learned</w:t>
+      </w:r>
+    </w:p>
+    <w:p>
+      <w:pPr>
+        <w:numPr>
+          <w:ilvl w:val="0"/>
+          <w:numId w:val="3"/>
+        </w:numPr>
+        <w:rPr>
+          <w:b/>
+          <w:bCs/>
+        </w:rPr>
+      </w:pPr>
+      <w:r>
+        <w:rPr>
+          <w:b/>
+          <w:bCs/>
+        </w:rPr>
+        <w:t xml:space="preserve">Local Storage – Browser storage used to persist user data such as authentication tokens and profile information. </w:t>
+      </w:r>
+    </w:p>
+    <w:p>
+      <w:pPr>
+        <w:numPr>
+          <w:ilvl w:val="0"/>
+          <w:numId w:val="3"/>
+        </w:numPr>
+        <w:rPr>
+          <w:b/>
+          <w:bCs/>
+        </w:rPr>
+      </w:pPr>
+      <w:r>
+        <w:rPr>
+          <w:b/>
+          <w:bCs/>
+        </w:rPr>
+        <w:t xml:space="preserve">Protected Route – A reusable component that allows access only to authenticated users and redirects unauthenticated users to the Login page. </w:t>
+      </w:r>
+    </w:p>
+    <w:p>
+      <w:pPr>
+        <w:numPr>
+          <w:ilvl w:val="0"/>
+          <w:numId w:val="3"/>
+        </w:numPr>
+        <w:rPr>
+          <w:b/>
+          <w:bCs/>
+        </w:rPr>
+      </w:pPr>
+      <w:r>
+        <w:rPr>
+          <w:b/>
+          <w:bCs/>
+        </w:rPr>
+        <w:t xml:space="preserve">Authentication Flow – The complete process of login, storing user information, accessing protected pages, and securely logging out. </w:t>
+      </w:r>
+    </w:p>
+    <w:p>
+      <w:pPr>
+        <w:numPr>
+          <w:ilvl w:val="0"/>
+          <w:numId w:val="3"/>
+        </w:numPr>
+        <w:rPr>
+          <w:b/>
+          <w:bCs/>
+        </w:rPr>
+      </w:pPr>
+      <w:r>
+        <w:rPr>
+          <w:b/>
+          <w:bCs/>
+        </w:rPr>
+        <w:t xml:space="preserve">Session Management – Managing the authenticated user's session by storing and clearing user information appropriately. </w:t>
+      </w:r>
+    </w:p>
+    <w:p>
+      <w:pPr>
+        <w:numPr>
+          <w:ilvl w:val="0"/>
+          <w:numId w:val="3"/>
+        </w:numPr>
+        <w:rPr>
+          <w:b/>
+          <w:bCs/>
+        </w:rPr>
+      </w:pPr>
+      <w:r>
+        <w:rPr>
+          <w:b/>
+          <w:bCs/>
+        </w:rPr>
+        <w:t>Conditional Rendering – Displaying UI elements dynamically based on the application's current state, such as showing the logged-in user's name.</w:t>
+      </w:r>
+    </w:p>
+    <w:p>
+      <w:pPr>
+        <w:rPr>
+          <w:b/>
+          <w:bCs/>
+        </w:rPr>
+      </w:pPr>
+    </w:p>
     <w:sectPr>
       <w:pgSz w:w="12240" w:h="15840"/>
       <w:pgMar w:top="1080" w:right="1260" w:bottom="1080" w:left="1260" w:header="708" w:footer="708" w:gutter="0"/>
@@ -6735,6 +7020,155 @@
       <w:lvlJc w:val="left"/>
     </w:lvl>
   </w:abstractNum>
+  <w:abstractNum w:abstractNumId="3" w15:restartNumberingAfterBreak="0">
+    <w:nsid w:val="668723F4"/>
+    <w:multiLevelType w:val="multilevel"/>
+    <w:tmpl w:val="13B69F00"/>
+    <w:lvl w:ilvl="0">
+      <w:start w:val="1"/>
+      <w:numFmt w:val="bullet"/>
+      <w:lvlText w:val=""/>
+      <w:lvlJc w:val="left"/>
+      <w:pPr>
+        <w:tabs>
+          <w:tab w:val="num" w:pos="720"/>
+        </w:tabs>
+        <w:ind w:left="720" w:hanging="360"/>
+      </w:pPr>
+      <w:rPr>
+        <w:rFonts w:ascii="Symbol" w:hAnsi="Symbol" w:hint="default"/>
+        <w:sz w:val="20"/>
+      </w:rPr>
+    </w:lvl>
+    <w:lvl w:ilvl="1" w:tentative="1">
+      <w:start w:val="1"/>
+      <w:numFmt w:val="bullet"/>
+      <w:lvlText w:val="o"/>
+      <w:lvlJc w:val="left"/>
+      <w:pPr>
+        <w:tabs>
+          <w:tab w:val="num" w:pos="1440"/>
+        </w:tabs>
+        <w:ind w:left="1440" w:hanging="360"/>
+      </w:pPr>
+      <w:rPr>
+        <w:rFonts w:ascii="Courier New" w:hAnsi="Courier New" w:hint="default"/>
+        <w:sz w:val="20"/>
+      </w:rPr>
+    </w:lvl>
+    <w:lvl w:ilvl="2" w:tentative="1">
+      <w:start w:val="1"/>
+      <w:numFmt w:val="bullet"/>
+      <w:lvlText w:val=""/>
+      <w:lvlJc w:val="left"/>
+      <w:pPr>
+        <w:tabs>
+          <w:tab w:val="num" w:pos="2160"/>
+        </w:tabs>
+        <w:ind w:left="2160" w:hanging="360"/>
+      </w:pPr>
+      <w:rPr>
+        <w:rFonts w:ascii="Wingdings" w:hAnsi="Wingdings" w:hint="default"/>
+        <w:sz w:val="20"/>
+      </w:rPr>
+    </w:lvl>
+    <w:lvl w:ilvl="3" w:tentative="1">
+      <w:start w:val="1"/>
+      <w:numFmt w:val="bullet"/>
+      <w:lvlText w:val=""/>
+      <w:lvlJc w:val="left"/>
+      <w:pPr>
+        <w:tabs>
+          <w:tab w:val="num" w:pos="2880"/>
+        </w:tabs>
+        <w:ind w:left="2880" w:hanging="360"/>
+      </w:pPr>
+      <w:rPr>
+        <w:rFonts w:ascii="Wingdings" w:hAnsi="Wingdings" w:hint="default"/>
+        <w:sz w:val="20"/>
+      </w:rPr>
+    </w:lvl>
+    <w:lvl w:ilvl="4" w:tentative="1">
+      <w:start w:val="1"/>
+      <w:numFmt w:val="bullet"/>
+      <w:lvlText w:val=""/>
+      <w:lvlJc w:val="left"/>
+      <w:pPr>
+        <w:tabs>
+          <w:tab w:val="num" w:pos="3600"/>
+        </w:tabs>
+        <w:ind w:left="3600" w:hanging="360"/>
+      </w:pPr>
+      <w:rPr>
+        <w:rFonts w:ascii="Wingdings" w:hAnsi="Wingdings" w:hint="default"/>
+        <w:sz w:val="20"/>
+      </w:rPr>
+    </w:lvl>
+    <w:lvl w:ilvl="5" w:tentative="1">
+      <w:start w:val="1"/>
+      <w:numFmt w:val="bullet"/>
+      <w:lvlText w:val=""/>
+      <w:lvlJc w:val="left"/>
+      <w:pPr>
+        <w:tabs>
+          <w:tab w:val="num" w:pos="4320"/>
+        </w:tabs>
+        <w:ind w:left="4320" w:hanging="360"/>
+      </w:pPr>
+      <w:rPr>
+        <w:rFonts w:ascii="Wingdings" w:hAnsi="Wingdings" w:hint="default"/>
+        <w:sz w:val="20"/>
+      </w:rPr>
+    </w:lvl>
+    <w:lvl w:ilvl="6" w:tentative="1">
+      <w:start w:val="1"/>
+      <w:numFmt w:val="bullet"/>
+      <w:lvlText w:val=""/>
+      <w:lvlJc w:val="left"/>
+      <w:pPr>
+        <w:tabs>
+          <w:tab w:val="num" w:pos="5040"/>
+        </w:tabs>
+        <w:ind w:left="5040" w:hanging="360"/>
+      </w:pPr>
+      <w:rPr>
+        <w:rFonts w:ascii="Wingdings" w:hAnsi="Wingdings" w:hint="default"/>
+        <w:sz w:val="20"/>
+      </w:rPr>
+    </w:lvl>
+    <w:lvl w:ilvl="7" w:tentative="1">
+      <w:start w:val="1"/>
+      <w:numFmt w:val="bullet"/>
+      <w:lvlText w:val=""/>
+      <w:lvlJc w:val="left"/>
+      <w:pPr>
+        <w:tabs>
+          <w:tab w:val="num" w:pos="5760"/>
+        </w:tabs>
+        <w:ind w:left="5760" w:hanging="360"/>
+      </w:pPr>
+      <w:rPr>
+        <w:rFonts w:ascii="Wingdings" w:hAnsi="Wingdings" w:hint="default"/>
+        <w:sz w:val="20"/>
+      </w:rPr>
+    </w:lvl>
+    <w:lvl w:ilvl="8" w:tentative="1">
+      <w:start w:val="1"/>
+      <w:numFmt w:val="bullet"/>
+      <w:lvlText w:val=""/>
+      <w:lvlJc w:val="left"/>
+      <w:pPr>
+        <w:tabs>
+          <w:tab w:val="num" w:pos="6480"/>
+        </w:tabs>
+        <w:ind w:left="6480" w:hanging="360"/>
+      </w:pPr>
+      <w:rPr>
+        <w:rFonts w:ascii="Wingdings" w:hAnsi="Wingdings" w:hint="default"/>
+        <w:sz w:val="20"/>
+      </w:rPr>
+    </w:lvl>
+  </w:abstractNum>
   <w:num w:numId="1" w16cid:durableId="1366296264">
     <w:abstractNumId w:val="0"/>
     <w:lvlOverride w:ilvl="0">
@@ -6746,6 +7180,9 @@
     <w:lvlOverride w:ilvl="0">
       <w:startOverride w:val="1"/>
     </w:lvlOverride>
+  </w:num>
+  <w:num w:numId="3" w16cid:durableId="948584883">
+    <w:abstractNumId w:val="3"/>
   </w:num>
 </w:numbering>
 </file>

</xml_diff>